<commit_message>
Door plates for Starlit Channeler and Reader of Omens (DM-approved)
The Warden's Mantle plate (the spear-bearing Warden of starlight
standing guard over Ursa's widened glow) floats into the Starlit
block; the Dreamed Day plate (dawn on the eastward trail, the
sigil-stone warm in his palm, two orbs of dreamed light) replaces
the generic Ursa portrait in the Reader section. Both generated
from ursa_v3_portrait.png for character consistency, banked with
manifest entries; compendium, handouts, and book rebuilt.

Co-Authored-By: Claude Opus 4.8 <noreply@anthropic.com>
</commit_message>
<xml_diff>
--- a/characters/path_rewards/ursa_path_rewards_v3.docx
+++ b/characters/path_rewards/ursa_path_rewards_v3.docx
@@ -2075,6 +2075,52 @@
     </w:p>
     <w:p>
       <w:pPr>
+        <w:spacing w:after="0" w:before="0"/>
+      </w:pPr>
+      <w:r>
+        <w:drawing>
+          <wp:anchor xmlns:a="http://schemas.openxmlformats.org/drawingml/2006/main" behindDoc="0" distT="91440" distB="100584" distL="201600" distR="201600" simplePos="0" locked="0" layoutInCell="1" allowOverlap="0" relativeHeight="2">
+            <wp:simplePos x="0" y="0"/>
+            <wp:positionH relativeFrom="column">
+              <wp:align>right</wp:align>
+            </wp:positionH>
+            <wp:positionV relativeFrom="paragraph">
+              <wp:posOffset>0</wp:posOffset>
+            </wp:positionV>
+            <wp:extent cx="2377440" cy="2377440"/>
+            <wp:effectExtent l="0" t="0" r="0" b="0"/>
+            <wp:wrapSquare wrapText="bothSides"/>
+            <wp:docPr id="7" name="Picture 7"/>
+            <wp:cNvGraphicFramePr/>
+            <a:graphic xmlns:pic="http://schemas.openxmlformats.org/drawingml/2006/picture">
+              <a:graphicData uri="http://schemas.openxmlformats.org/drawingml/2006/picture">
+                <pic:pic>
+                  <pic:nvPicPr>
+                    <pic:cNvPr id="0" name="image.jpg"/>
+                    <pic:cNvPicPr/>
+                  </pic:nvPicPr>
+                  <pic:blipFill>
+                    <a:blip r:embed="rId16"/>
+                    <a:stretch>
+                      <a:fillRect/>
+                    </a:stretch>
+                  </pic:blipFill>
+                  <pic:spPr>
+                    <a:xfrm>
+                      <a:off x="0" y="0"/>
+                      <a:ext cx="2377440" cy="2377440"/>
+                    </a:xfrm>
+                    <a:prstGeom prst="rect"/>
+                  </pic:spPr>
+                </pic:pic>
+              </a:graphicData>
+            </a:graphic>
+          </wp:anchor>
+        </w:drawing>
+      </w:r>
+    </w:p>
+    <w:p>
+      <w:pPr>
         <w:pBdr>
           <w:left w:val="single" w:sz="18" w:space="12" w:color="B8860B"/>
         </w:pBdr>
@@ -2501,10 +2547,10 @@
             <wp:positionV relativeFrom="paragraph">
               <wp:posOffset>0</wp:posOffset>
             </wp:positionV>
-            <wp:extent cx="2468880" cy="2468880"/>
+            <wp:extent cx="2377440" cy="2377440"/>
             <wp:effectExtent l="0" t="0" r="0" b="0"/>
             <wp:wrapSquare wrapText="bothSides"/>
-            <wp:docPr id="7" name="Picture 7"/>
+            <wp:docPr id="8" name="Picture 8"/>
             <wp:cNvGraphicFramePr/>
             <a:graphic xmlns:pic="http://schemas.openxmlformats.org/drawingml/2006/picture">
               <a:graphicData uri="http://schemas.openxmlformats.org/drawingml/2006/picture">
@@ -2514,7 +2560,7 @@
                     <pic:cNvPicPr/>
                   </pic:nvPicPr>
                   <pic:blipFill>
-                    <a:blip r:embed="rId11"/>
+                    <a:blip r:embed="rId17"/>
                     <a:stretch>
                       <a:fillRect/>
                     </a:stretch>
@@ -2522,7 +2568,7 @@
                   <pic:spPr>
                     <a:xfrm>
                       <a:off x="0" y="0"/>
-                      <a:ext cx="2468880" cy="2468880"/>
+                      <a:ext cx="2377440" cy="2377440"/>
                     </a:xfrm>
                     <a:prstGeom prst="rect"/>
                   </pic:spPr>

</xml_diff>